<commit_message>
update dataset (translate all to russian and cut MAX2.0 project)
</commit_message>
<xml_diff>
--- a/data/project_documents/project_summary_001.docx
+++ b/data/project_documents/project_summary_001.docx
@@ -300,7 +300,7 @@
         <w:pStyle w:val="ListBullet"/>
       </w:pPr>
       <w:r>
-        <w:t>ROC-AUC не ниже 0.75</w:t>
+        <w:t>Точность ранжирования не ниже 0.75</w:t>
       </w:r>
     </w:p>
     <w:p>
@@ -308,7 +308,7 @@
         <w:pStyle w:val="ListBullet"/>
       </w:pPr>
       <w:r>
-        <w:t>F1-score не ниже 0.62</w:t>
+        <w:t>Мера качества не ниже 0.62</w:t>
       </w:r>
     </w:p>
     <w:p>

</xml_diff>